<commit_message>
Article: family-to-effect execution mapping, abstract with equal-budget and independent-gate figures, contributions sentence, index terms, symbols for thresholds, held-out wording, Fig. 4 phase labels re-exported; supplement equation reference and coverage symbol
Co-Authored-By: Claude Fable 5.1 <noreply@anthropic.com>
Claude-Session: https://claude.ai/code/session_01SpJY1eTMuWxnLRbAr2HJ4M
</commit_message>
<xml_diff>
--- a/02_Article/ieee_systems/GODA_Supplementary_Material.docx
+++ b/02_Article/ieee_systems/GODA_Supplementary_Material.docx
@@ -3955,7 +3955,7 @@
         <w:rPr/>
       </w:pPr>
       <w:r>
-        <w:t xml:space="preserve">The five membership trapezoids are VL (0, 0, 0.15, 0.30), L (0.15, 0.30, 0.35, 0.50), M (0.35, 0.50, 0.55, 0.70), H (0.55, 0.70, 0.75, 0.90) and VH (0.75, 0.90, 1, 1). Coverage is 0.05, persistence 0.9 per cycle, adaptation step 0.05, term insertion threshold 0.62 and attention threshold 0.35; monitored regions retain a share floor of 0.50. Adaptation is eligible once per decision interval, with at most two proposal revisions. Wind is in m/s, humidity in percent, temperature in °C and distance in cells. Clause amplitudes at most 0.05 are ignored; head/flank/rear cosine thresholds are ±0.35. Wet, clear and ignite require reach exp(−0.03 times travel minutes) times max(access, 0.9 times air availability) above 0.05 while at least 50 cells burn. Clear and ignite exclude urban and water cells.</w:t>
+        <w:t xml:space="preserve">The five membership trapezoids are VL (0, 0, 0.15, 0.30), L (0.15, 0.30, 0.35, 0.50), M (0.35, 0.50, 0.55, 0.70), H (0.55, 0.70, 0.75, 0.90) and VH (0.75, 0.90, 1, 1). The coverage floor αmin is 0.05, persistence 0.9 per cycle, adaptation step 0.05, term insertion threshold 0.62 and attention threshold 0.35; monitored regions retain a share floor of 0.50. Adaptation is eligible once per decision interval, with at most two proposal revisions. Wind is in m/s, humidity in percent, temperature in °C and distance in cells. Clause amplitudes at most 0.05 are ignored; head/flank/rear cosine thresholds are ±0.35. Wet, clear and ignite require reach exp(−0.03 times travel minutes) times max(access, 0.9 times air availability) above 0.05 while at least 50 cells burn. Clear and ignite exclude urban and water cells.</w:t>
       </w:r>
     </w:p>
     <w:p>
@@ -4116,7 +4116,7 @@
           <w:sz w:val="16"/>
           <w:szCs w:val="16"/>
         </w:rPr>
-        <w:t xml:space="preserve">DOCTRINE FAMILIES (seed rules draw only on these): the six families of (15).</w:t>
+        <w:t xml:space="preserve">DOCTRINE FAMILIES (seed rules draw only on these): the six families of (13).</w:t>
       </w:r>
     </w:p>
     <w:p>

</xml_diff>